<commit_message>
Save current state before rsdmx migration
Preserving the current rdbnomics-based teaching materials before
transitioning to rsdmx for SDMX data access.

🤖 Generated with [Claude Code](https://claude.com/claude-code)

Co-Authored-By: Claude <noreply@anthropic.com>
</commit_message>
<xml_diff>
--- a/_site/teaching_materials/example2_statistics_estonia.docx
+++ b/_site/teaching_materials/example2_statistics_estonia.docx
@@ -927,159 +927,6 @@
     </w:p>
     <w:p>
       <w:pPr>
-        <w:pStyle w:val="SourceCode"/>
-      </w:pPr>
-      <w:r>
-        <w:rPr>
-          <w:rStyle w:val="NormalTok"/>
-        </w:rPr>
-        <w:t xml:space="preserve">pa111_meta </w:t>
-      </w:r>
-      <w:r>
-        <w:rPr>
-          <w:rStyle w:val="OtherTok"/>
-        </w:rPr>
-        <w:t xml:space="preserve">&lt;-</w:t>
-      </w:r>
-      <w:r>
-        <w:rPr>
-          <w:rStyle w:val="NormalTok"/>
-        </w:rPr>
-        <w:t xml:space="preserve"> </w:t>
-      </w:r>
-      <w:r>
-        <w:rPr>
-          <w:rStyle w:val="FunctionTok"/>
-        </w:rPr>
-        <w:t xml:space="preserve">pxweb_get</w:t>
-      </w:r>
-      <w:r>
-        <w:rPr>
-          <w:rStyle w:val="NormalTok"/>
-        </w:rPr>
-        <w:t xml:space="preserve">(</w:t>
-      </w:r>
-      <w:r>
-        <w:br/>
-      </w:r>
-      <w:r>
-        <w:rPr>
-          <w:rStyle w:val="NormalTok"/>
-        </w:rPr>
-        <w:t xml:space="preserve">  </w:t>
-      </w:r>
-      <w:r>
-        <w:rPr>
-          <w:rStyle w:val="AttributeTok"/>
-        </w:rPr>
-        <w:t xml:space="preserve">url =</w:t>
-      </w:r>
-      <w:r>
-        <w:rPr>
-          <w:rStyle w:val="NormalTok"/>
-        </w:rPr>
-        <w:t xml:space="preserve"> </w:t>
-      </w:r>
-      <w:r>
-        <w:rPr>
-          <w:rStyle w:val="StringTok"/>
-        </w:rPr>
-        <w:t xml:space="preserve">"https://andmed.stat.ee/api/v1/en/stat/PA111"</w:t>
-      </w:r>
-      <w:r>
-        <w:rPr>
-          <w:rStyle w:val="NormalTok"/>
-        </w:rPr>
-        <w:t xml:space="preserve">)</w:t>
-      </w:r>
-      <w:r>
-        <w:br/>
-      </w:r>
-      <w:r>
-        <w:rPr>
-          <w:rStyle w:val="NormalTok"/>
-        </w:rPr>
-        <w:t xml:space="preserve">pa111_meta</w:t>
-      </w:r>
-    </w:p>
-    <w:p>
-      <w:pPr>
-        <w:pStyle w:val="SourceCode"/>
-      </w:pPr>
-      <w:r>
-        <w:rPr>
-          <w:rStyle w:val="VerbatimChar"/>
-        </w:rPr>
-        <w:t xml:space="preserve">PXWEB METADATA</w:t>
-      </w:r>
-      <w:r>
-        <w:br/>
-      </w:r>
-      <w:r>
-        <w:rPr>
-          <w:rStyle w:val="VerbatimChar"/>
-        </w:rPr>
-        <w:t xml:space="preserve">PA111: AVERAGE MONTHLY GROSS WAGES (SALARIES), MEDIAN, DECILES AND NUMBER OF EMPLOYEES BY ECONOMIC ACTIVITY SECTION (QUARTERLY) </w:t>
-      </w:r>
-      <w:r>
-        <w:br/>
-      </w:r>
-      <w:r>
-        <w:rPr>
-          <w:rStyle w:val="VerbatimChar"/>
-        </w:rPr>
-        <w:t xml:space="preserve">variables:</w:t>
-      </w:r>
-      <w:r>
-        <w:br/>
-      </w:r>
-      <w:r>
-        <w:rPr>
-          <w:rStyle w:val="VerbatimChar"/>
-        </w:rPr>
-        <w:t xml:space="preserve"> [[1]] Näitaja: Indicator</w:t>
-      </w:r>
-      <w:r>
-        <w:br/>
-      </w:r>
-      <w:r>
-        <w:rPr>
-          <w:rStyle w:val="VerbatimChar"/>
-        </w:rPr>
-        <w:t xml:space="preserve"> [[2]] Tegevusala: Economic activity</w:t>
-      </w:r>
-      <w:r>
-        <w:br/>
-      </w:r>
-      <w:r>
-        <w:rPr>
-          <w:rStyle w:val="VerbatimChar"/>
-        </w:rPr>
-        <w:t xml:space="preserve"> [[3]] Vaatlusperiood: Reference period</w:t>
-      </w:r>
-    </w:p>
-    <w:p>
-      <w:pPr>
-        <w:pStyle w:val="FirstParagraph"/>
-      </w:pPr>
-      <w:r>
-        <w:t xml:space="preserve">The object is just metadata, no data yet!</w:t>
-      </w:r>
-    </w:p>
-    <w:p>
-      <w:pPr>
-        <w:pStyle w:val="BodyText"/>
-      </w:pPr>
-      <w:r>
-        <w:rPr>
-          <w:i/>
-          <w:iCs/>
-        </w:rPr>
-        <w:t xml:space="preserve">How to identify key-value pairs?</w:t>
-      </w:r>
-    </w:p>
-    <w:p>
-      <w:pPr>
         <w:pStyle w:val="Compact"/>
         <w:numPr>
           <w:ilvl w:val="0"/>
@@ -1087,6 +934,171 @@
         </w:numPr>
       </w:pPr>
       <w:r>
+        <w:t xml:space="preserve">Example dataset: PA111 - AVERAGE MONTHLY GROSS WAGES (SALARIES)</w:t>
+      </w:r>
+    </w:p>
+    <w:p>
+      <w:pPr>
+        <w:pStyle w:val="SourceCode"/>
+      </w:pPr>
+      <w:r>
+        <w:rPr>
+          <w:rStyle w:val="NormalTok"/>
+        </w:rPr>
+        <w:t xml:space="preserve">pa111_meta </w:t>
+      </w:r>
+      <w:r>
+        <w:rPr>
+          <w:rStyle w:val="OtherTok"/>
+        </w:rPr>
+        <w:t xml:space="preserve">&lt;-</w:t>
+      </w:r>
+      <w:r>
+        <w:rPr>
+          <w:rStyle w:val="NormalTok"/>
+        </w:rPr>
+        <w:t xml:space="preserve"> </w:t>
+      </w:r>
+      <w:r>
+        <w:rPr>
+          <w:rStyle w:val="FunctionTok"/>
+        </w:rPr>
+        <w:t xml:space="preserve">pxweb_get</w:t>
+      </w:r>
+      <w:r>
+        <w:rPr>
+          <w:rStyle w:val="NormalTok"/>
+        </w:rPr>
+        <w:t xml:space="preserve">(</w:t>
+      </w:r>
+      <w:r>
+        <w:br/>
+      </w:r>
+      <w:r>
+        <w:rPr>
+          <w:rStyle w:val="NormalTok"/>
+        </w:rPr>
+        <w:t xml:space="preserve">  </w:t>
+      </w:r>
+      <w:r>
+        <w:rPr>
+          <w:rStyle w:val="AttributeTok"/>
+        </w:rPr>
+        <w:t xml:space="preserve">url =</w:t>
+      </w:r>
+      <w:r>
+        <w:rPr>
+          <w:rStyle w:val="NormalTok"/>
+        </w:rPr>
+        <w:t xml:space="preserve"> </w:t>
+      </w:r>
+      <w:r>
+        <w:rPr>
+          <w:rStyle w:val="StringTok"/>
+        </w:rPr>
+        <w:t xml:space="preserve">"https://andmed.stat.ee/api/v1/en/stat/PA111"</w:t>
+      </w:r>
+      <w:r>
+        <w:rPr>
+          <w:rStyle w:val="NormalTok"/>
+        </w:rPr>
+        <w:t xml:space="preserve">)</w:t>
+      </w:r>
+      <w:r>
+        <w:br/>
+      </w:r>
+      <w:r>
+        <w:rPr>
+          <w:rStyle w:val="NormalTok"/>
+        </w:rPr>
+        <w:t xml:space="preserve">pa111_meta</w:t>
+      </w:r>
+    </w:p>
+    <w:p>
+      <w:pPr>
+        <w:pStyle w:val="SourceCode"/>
+      </w:pPr>
+      <w:r>
+        <w:rPr>
+          <w:rStyle w:val="VerbatimChar"/>
+        </w:rPr>
+        <w:t xml:space="preserve">PXWEB METADATA</w:t>
+      </w:r>
+      <w:r>
+        <w:br/>
+      </w:r>
+      <w:r>
+        <w:rPr>
+          <w:rStyle w:val="VerbatimChar"/>
+        </w:rPr>
+        <w:t xml:space="preserve">PA111: AVERAGE MONTHLY GROSS WAGES (SALARIES), MEDIAN, DECILES AND NUMBER OF EMPLOYEES BY ECONOMIC ACTIVITY SECTION (QUARTERLY) </w:t>
+      </w:r>
+      <w:r>
+        <w:br/>
+      </w:r>
+      <w:r>
+        <w:rPr>
+          <w:rStyle w:val="VerbatimChar"/>
+        </w:rPr>
+        <w:t xml:space="preserve">variables:</w:t>
+      </w:r>
+      <w:r>
+        <w:br/>
+      </w:r>
+      <w:r>
+        <w:rPr>
+          <w:rStyle w:val="VerbatimChar"/>
+        </w:rPr>
+        <w:t xml:space="preserve"> [[1]] Näitaja: Indicator</w:t>
+      </w:r>
+      <w:r>
+        <w:br/>
+      </w:r>
+      <w:r>
+        <w:rPr>
+          <w:rStyle w:val="VerbatimChar"/>
+        </w:rPr>
+        <w:t xml:space="preserve"> [[2]] Tegevusala: Economic activity</w:t>
+      </w:r>
+      <w:r>
+        <w:br/>
+      </w:r>
+      <w:r>
+        <w:rPr>
+          <w:rStyle w:val="VerbatimChar"/>
+        </w:rPr>
+        <w:t xml:space="preserve"> [[3]] Vaatlusperiood: Reference period</w:t>
+      </w:r>
+    </w:p>
+    <w:p>
+      <w:pPr>
+        <w:pStyle w:val="FirstParagraph"/>
+      </w:pPr>
+      <w:r>
+        <w:t xml:space="preserve">The object is just metadata, no data yet!</w:t>
+      </w:r>
+    </w:p>
+    <w:p>
+      <w:pPr>
+        <w:pStyle w:val="BodyText"/>
+      </w:pPr>
+      <w:r>
+        <w:rPr>
+          <w:i/>
+          <w:iCs/>
+        </w:rPr>
+        <w:t xml:space="preserve">How to identify key-value pairs?</w:t>
+      </w:r>
+    </w:p>
+    <w:p>
+      <w:pPr>
+        <w:pStyle w:val="Compact"/>
+        <w:numPr>
+          <w:ilvl w:val="0"/>
+          <w:numId w:val="1005"/>
+        </w:numPr>
+      </w:pPr>
+      <w:r>
         <w:t xml:space="preserve">Use either:</w:t>
       </w:r>
     </w:p>
@@ -1095,7 +1107,7 @@
         <w:pStyle w:val="Compact"/>
         <w:numPr>
           <w:ilvl w:val="1"/>
-          <w:numId w:val="1005"/>
+          <w:numId w:val="1006"/>
         </w:numPr>
       </w:pPr>
       <w:r>
@@ -1107,7 +1119,7 @@
         <w:pStyle w:val="Compact"/>
         <w:numPr>
           <w:ilvl w:val="1"/>
-          <w:numId w:val="1005"/>
+          <w:numId w:val="1006"/>
         </w:numPr>
       </w:pPr>
       <w:r>
@@ -1132,305 +1144,6 @@
       </w:pPr>
       <w:r>
         <w:t xml:space="preserve">5 Key-value pairs</w:t>
-      </w:r>
-    </w:p>
-    <w:p>
-      <w:pPr>
-        <w:pStyle w:val="Compact"/>
-        <w:numPr>
-          <w:ilvl w:val="0"/>
-          <w:numId w:val="1006"/>
-        </w:numPr>
-      </w:pPr>
-      <w:r>
-        <w:t xml:space="preserve">Values for the first key (Näitaja)</w:t>
-      </w:r>
-    </w:p>
-    <w:p>
-      <w:pPr>
-        <w:pStyle w:val="SourceCode"/>
-      </w:pPr>
-      <w:r>
-        <w:rPr>
-          <w:rStyle w:val="NormalTok"/>
-        </w:rPr>
-        <w:t xml:space="preserve">pa111_meta</w:t>
-      </w:r>
-      <w:r>
-        <w:rPr>
-          <w:rStyle w:val="SpecialCharTok"/>
-        </w:rPr>
-        <w:t xml:space="preserve">$</w:t>
-      </w:r>
-      <w:r>
-        <w:rPr>
-          <w:rStyle w:val="NormalTok"/>
-        </w:rPr>
-        <w:t xml:space="preserve">variables[[</w:t>
-      </w:r>
-      <w:r>
-        <w:rPr>
-          <w:rStyle w:val="DecValTok"/>
-        </w:rPr>
-        <w:t xml:space="preserve">1</w:t>
-      </w:r>
-      <w:r>
-        <w:rPr>
-          <w:rStyle w:val="NormalTok"/>
-        </w:rPr>
-        <w:t xml:space="preserve">]]</w:t>
-      </w:r>
-    </w:p>
-    <w:p>
-      <w:pPr>
-        <w:pStyle w:val="SourceCode"/>
-      </w:pPr>
-      <w:r>
-        <w:rPr>
-          <w:rStyle w:val="VerbatimChar"/>
-        </w:rPr>
-        <w:t xml:space="preserve">$code</w:t>
-      </w:r>
-      <w:r>
-        <w:br/>
-      </w:r>
-      <w:r>
-        <w:rPr>
-          <w:rStyle w:val="VerbatimChar"/>
-        </w:rPr>
-        <w:t xml:space="preserve">[1] "Näitaja"</w:t>
-      </w:r>
-      <w:r>
-        <w:br/>
-      </w:r>
-      <w:r>
-        <w:br/>
-      </w:r>
-      <w:r>
-        <w:rPr>
-          <w:rStyle w:val="VerbatimChar"/>
-        </w:rPr>
-        <w:t xml:space="preserve">$text</w:t>
-      </w:r>
-      <w:r>
-        <w:br/>
-      </w:r>
-      <w:r>
-        <w:rPr>
-          <w:rStyle w:val="VerbatimChar"/>
-        </w:rPr>
-        <w:t xml:space="preserve">[1] "Indicator"</w:t>
-      </w:r>
-      <w:r>
-        <w:br/>
-      </w:r>
-      <w:r>
-        <w:br/>
-      </w:r>
-      <w:r>
-        <w:rPr>
-          <w:rStyle w:val="VerbatimChar"/>
-        </w:rPr>
-        <w:t xml:space="preserve">$values</w:t>
-      </w:r>
-      <w:r>
-        <w:br/>
-      </w:r>
-      <w:r>
-        <w:rPr>
-          <w:rStyle w:val="VerbatimChar"/>
-        </w:rPr>
-        <w:t xml:space="preserve"> [1] "GR_W_AVG"    "NR_EMPL"     "GR_W_D1"     "GR_W_D2"     "GR_W_D3"    </w:t>
-      </w:r>
-      <w:r>
-        <w:br/>
-      </w:r>
-      <w:r>
-        <w:rPr>
-          <w:rStyle w:val="VerbatimChar"/>
-        </w:rPr>
-        <w:t xml:space="preserve"> [6] "GR_W_D4"     "GR_W_D5"     "GR_W_D6"     "GR_W_D7"     "GR_W_D8"    </w:t>
-      </w:r>
-      <w:r>
-        <w:br/>
-      </w:r>
-      <w:r>
-        <w:rPr>
-          <w:rStyle w:val="VerbatimChar"/>
-        </w:rPr>
-        <w:t xml:space="preserve">[11] "GR_W_D9"     "GR_W_AVG_SM"</w:t>
-      </w:r>
-      <w:r>
-        <w:br/>
-      </w:r>
-      <w:r>
-        <w:br/>
-      </w:r>
-      <w:r>
-        <w:rPr>
-          <w:rStyle w:val="VerbatimChar"/>
-        </w:rPr>
-        <w:t xml:space="preserve">$valueTexts</w:t>
-      </w:r>
-      <w:r>
-        <w:br/>
-      </w:r>
-      <w:r>
-        <w:rPr>
-          <w:rStyle w:val="VerbatimChar"/>
-        </w:rPr>
-        <w:t xml:space="preserve"> [1] "Average monthly gross wages (salaries), euros"                                                  </w:t>
-      </w:r>
-      <w:r>
-        <w:br/>
-      </w:r>
-      <w:r>
-        <w:rPr>
-          <w:rStyle w:val="VerbatimChar"/>
-        </w:rPr>
-        <w:t xml:space="preserve"> [2] "Number of employees"                                                                            </w:t>
-      </w:r>
-      <w:r>
-        <w:br/>
-      </w:r>
-      <w:r>
-        <w:rPr>
-          <w:rStyle w:val="VerbatimChar"/>
-        </w:rPr>
-        <w:t xml:space="preserve"> [3] "1st decile of monthly gross wages (salaries), euros"                                            </w:t>
-      </w:r>
-      <w:r>
-        <w:br/>
-      </w:r>
-      <w:r>
-        <w:rPr>
-          <w:rStyle w:val="VerbatimChar"/>
-        </w:rPr>
-        <w:t xml:space="preserve"> [4] "2nd decile of monthly gross wages (salaries), euros"                                            </w:t>
-      </w:r>
-      <w:r>
-        <w:br/>
-      </w:r>
-      <w:r>
-        <w:rPr>
-          <w:rStyle w:val="VerbatimChar"/>
-        </w:rPr>
-        <w:t xml:space="preserve"> [5] "3rd decile of monthly gross wages (salaries), euros"                                            </w:t>
-      </w:r>
-      <w:r>
-        <w:br/>
-      </w:r>
-      <w:r>
-        <w:rPr>
-          <w:rStyle w:val="VerbatimChar"/>
-        </w:rPr>
-        <w:t xml:space="preserve"> [6] "4th decile of monthly gross wages (salaries), euros"                                            </w:t>
-      </w:r>
-      <w:r>
-        <w:br/>
-      </w:r>
-      <w:r>
-        <w:rPr>
-          <w:rStyle w:val="VerbatimChar"/>
-        </w:rPr>
-        <w:t xml:space="preserve"> [7] "Median (5th decile) of monthly gross wages (salaries), euros"                                   </w:t>
-      </w:r>
-      <w:r>
-        <w:br/>
-      </w:r>
-      <w:r>
-        <w:rPr>
-          <w:rStyle w:val="VerbatimChar"/>
-        </w:rPr>
-        <w:t xml:space="preserve"> [8] "6th decile of monthly gross wages (salaries), euros"                                            </w:t>
-      </w:r>
-      <w:r>
-        <w:br/>
-      </w:r>
-      <w:r>
-        <w:rPr>
-          <w:rStyle w:val="VerbatimChar"/>
-        </w:rPr>
-        <w:t xml:space="preserve"> [9] "7th decile of monthly gross wages (salaries), euros"                                            </w:t>
-      </w:r>
-      <w:r>
-        <w:br/>
-      </w:r>
-      <w:r>
-        <w:rPr>
-          <w:rStyle w:val="VerbatimChar"/>
-        </w:rPr>
-        <w:t xml:space="preserve">[10] "8th decile of monthly gross wages (salaries), euros"                                            </w:t>
-      </w:r>
-      <w:r>
-        <w:br/>
-      </w:r>
-      <w:r>
-        <w:rPr>
-          <w:rStyle w:val="VerbatimChar"/>
-        </w:rPr>
-        <w:t xml:space="preserve">[11] "9th decile of monthly gross wages (salaries), euros"                                            </w:t>
-      </w:r>
-      <w:r>
-        <w:br/>
-      </w:r>
-      <w:r>
-        <w:rPr>
-          <w:rStyle w:val="VerbatimChar"/>
-        </w:rPr>
-        <w:t xml:space="preserve">[12] "Percentage change in average gross wages (salaries) compared to same period in previous year, %"</w:t>
-      </w:r>
-      <w:r>
-        <w:br/>
-      </w:r>
-      <w:r>
-        <w:br/>
-      </w:r>
-      <w:r>
-        <w:rPr>
-          <w:rStyle w:val="VerbatimChar"/>
-        </w:rPr>
-        <w:t xml:space="preserve">$elimination</w:t>
-      </w:r>
-      <w:r>
-        <w:br/>
-      </w:r>
-      <w:r>
-        <w:rPr>
-          <w:rStyle w:val="VerbatimChar"/>
-        </w:rPr>
-        <w:t xml:space="preserve">[1] FALSE</w:t>
-      </w:r>
-      <w:r>
-        <w:br/>
-      </w:r>
-      <w:r>
-        <w:br/>
-      </w:r>
-      <w:r>
-        <w:rPr>
-          <w:rStyle w:val="VerbatimChar"/>
-        </w:rPr>
-        <w:t xml:space="preserve">$time</w:t>
-      </w:r>
-      <w:r>
-        <w:br/>
-      </w:r>
-      <w:r>
-        <w:rPr>
-          <w:rStyle w:val="VerbatimChar"/>
-        </w:rPr>
-        <w:t xml:space="preserve">[1] FALSE</w:t>
-      </w:r>
-    </w:p>
-    <w:bookmarkEnd w:id="27"/>
-    <w:bookmarkStart w:id="28" w:name="fetch-data"/>
-    <w:p>
-      <w:pPr>
-        <w:pStyle w:val="Heading2"/>
-      </w:pPr>
-      <w:r>
-        <w:t xml:space="preserve">6 Fetch data</w:t>
       </w:r>
     </w:p>
     <w:p>
@@ -1442,34 +1155,7 @@
         </w:numPr>
       </w:pPr>
       <w:r>
-        <w:t xml:space="preserve">Set: Key-value pair (as R list object) &amp; Url to the database</w:t>
-      </w:r>
-    </w:p>
-    <w:p>
-      <w:pPr>
-        <w:pStyle w:val="Compact"/>
-        <w:numPr>
-          <w:ilvl w:val="0"/>
-          <w:numId w:val="1007"/>
-        </w:numPr>
-      </w:pPr>
-      <w:r>
-        <w:t xml:space="preserve">Wildcard operator</w:t>
-      </w:r>
-      <w:r>
-        <w:t xml:space="preserve"> </w:t>
-      </w:r>
-      <w:r>
-        <w:rPr>
-          <w:rStyle w:val="VerbatimChar"/>
-        </w:rPr>
-        <w:t xml:space="preserve">*</w:t>
-      </w:r>
-      <w:r>
-        <w:t xml:space="preserve"> </w:t>
-      </w:r>
-      <w:r>
-        <w:t xml:space="preserve">to select all values</w:t>
+        <w:t xml:space="preserve">Values for the first key (Näitaja)</w:t>
       </w:r>
     </w:p>
     <w:p>
@@ -1480,304 +1166,283 @@
         <w:rPr>
           <w:rStyle w:val="NormalTok"/>
         </w:rPr>
-        <w:t xml:space="preserve">px_query_list1 </w:t>
-      </w:r>
-      <w:r>
-        <w:rPr>
-          <w:rStyle w:val="OtherTok"/>
-        </w:rPr>
-        <w:t xml:space="preserve">&lt;-</w:t>
-      </w:r>
-      <w:r>
-        <w:rPr>
-          <w:rStyle w:val="NormalTok"/>
-        </w:rPr>
-        <w:t xml:space="preserve"> </w:t>
-      </w:r>
-      <w:r>
-        <w:rPr>
-          <w:rStyle w:val="FunctionTok"/>
-        </w:rPr>
-        <w:t xml:space="preserve">list</w:t>
-      </w:r>
-      <w:r>
-        <w:rPr>
-          <w:rStyle w:val="NormalTok"/>
-        </w:rPr>
-        <w:t xml:space="preserve">(</w:t>
-      </w:r>
-      <w:r>
-        <w:br/>
-      </w:r>
-      <w:r>
-        <w:rPr>
-          <w:rStyle w:val="NormalTok"/>
-        </w:rPr>
-        <w:t xml:space="preserve">  </w:t>
-      </w:r>
-      <w:r>
-        <w:rPr>
-          <w:rStyle w:val="StringTok"/>
-        </w:rPr>
-        <w:t xml:space="preserve">"Näitaja"</w:t>
-      </w:r>
-      <w:r>
-        <w:rPr>
-          <w:rStyle w:val="NormalTok"/>
-        </w:rPr>
-        <w:t xml:space="preserve"> </w:t>
-      </w:r>
-      <w:r>
-        <w:rPr>
-          <w:rStyle w:val="OtherTok"/>
-        </w:rPr>
-        <w:t xml:space="preserve">=</w:t>
-      </w:r>
-      <w:r>
-        <w:rPr>
-          <w:rStyle w:val="NormalTok"/>
-        </w:rPr>
-        <w:t xml:space="preserve"> </w:t>
-      </w:r>
-      <w:r>
-        <w:rPr>
-          <w:rStyle w:val="FunctionTok"/>
-        </w:rPr>
-        <w:t xml:space="preserve">c</w:t>
-      </w:r>
-      <w:r>
-        <w:rPr>
-          <w:rStyle w:val="NormalTok"/>
-        </w:rPr>
-        <w:t xml:space="preserve">(</w:t>
-      </w:r>
-      <w:r>
-        <w:rPr>
-          <w:rStyle w:val="StringTok"/>
-        </w:rPr>
-        <w:t xml:space="preserve">"GR_W_D1"</w:t>
-      </w:r>
-      <w:r>
-        <w:rPr>
-          <w:rStyle w:val="NormalTok"/>
-        </w:rPr>
-        <w:t xml:space="preserve">, </w:t>
-      </w:r>
-      <w:r>
-        <w:rPr>
-          <w:rStyle w:val="StringTok"/>
-        </w:rPr>
-        <w:t xml:space="preserve">"GR_W_D5"</w:t>
-      </w:r>
-      <w:r>
-        <w:rPr>
-          <w:rStyle w:val="NormalTok"/>
-        </w:rPr>
-        <w:t xml:space="preserve">, </w:t>
-      </w:r>
-      <w:r>
-        <w:rPr>
-          <w:rStyle w:val="StringTok"/>
-        </w:rPr>
-        <w:t xml:space="preserve">"GR_W_D9"</w:t>
-      </w:r>
-      <w:r>
-        <w:rPr>
-          <w:rStyle w:val="NormalTok"/>
-        </w:rPr>
-        <w:t xml:space="preserve">),</w:t>
-      </w:r>
-      <w:r>
-        <w:br/>
-      </w:r>
-      <w:r>
-        <w:rPr>
-          <w:rStyle w:val="NormalTok"/>
-        </w:rPr>
-        <w:t xml:space="preserve">  </w:t>
-      </w:r>
-      <w:r>
-        <w:rPr>
-          <w:rStyle w:val="StringTok"/>
-        </w:rPr>
-        <w:t xml:space="preserve">"Tegevusala"</w:t>
-      </w:r>
-      <w:r>
-        <w:rPr>
-          <w:rStyle w:val="NormalTok"/>
-        </w:rPr>
-        <w:t xml:space="preserve"> </w:t>
-      </w:r>
-      <w:r>
-        <w:rPr>
-          <w:rStyle w:val="OtherTok"/>
-        </w:rPr>
-        <w:t xml:space="preserve">=</w:t>
-      </w:r>
-      <w:r>
-        <w:rPr>
-          <w:rStyle w:val="NormalTok"/>
-        </w:rPr>
-        <w:t xml:space="preserve"> </w:t>
-      </w:r>
-      <w:r>
-        <w:rPr>
-          <w:rStyle w:val="StringTok"/>
-        </w:rPr>
-        <w:t xml:space="preserve">"*"</w:t>
-      </w:r>
-      <w:r>
-        <w:rPr>
-          <w:rStyle w:val="NormalTok"/>
-        </w:rPr>
-        <w:t xml:space="preserve">,</w:t>
-      </w:r>
-      <w:r>
-        <w:br/>
-      </w:r>
-      <w:r>
-        <w:rPr>
-          <w:rStyle w:val="NormalTok"/>
-        </w:rPr>
-        <w:t xml:space="preserve">  </w:t>
-      </w:r>
-      <w:r>
-        <w:rPr>
-          <w:rStyle w:val="StringTok"/>
-        </w:rPr>
-        <w:t xml:space="preserve">"Vaatlusperiood"</w:t>
-      </w:r>
-      <w:r>
-        <w:rPr>
-          <w:rStyle w:val="NormalTok"/>
-        </w:rPr>
-        <w:t xml:space="preserve"> </w:t>
-      </w:r>
-      <w:r>
-        <w:rPr>
-          <w:rStyle w:val="OtherTok"/>
-        </w:rPr>
-        <w:t xml:space="preserve">=</w:t>
-      </w:r>
-      <w:r>
-        <w:rPr>
-          <w:rStyle w:val="NormalTok"/>
-        </w:rPr>
-        <w:t xml:space="preserve"> </w:t>
-      </w:r>
-      <w:r>
-        <w:rPr>
-          <w:rStyle w:val="StringTok"/>
-        </w:rPr>
-        <w:t xml:space="preserve">"*"</w:t>
-      </w:r>
-      <w:r>
-        <w:br/>
-      </w:r>
-      <w:r>
-        <w:rPr>
-          <w:rStyle w:val="NormalTok"/>
-        </w:rPr>
-        <w:t xml:space="preserve">)</w:t>
-      </w:r>
-      <w:r>
-        <w:br/>
-      </w:r>
-      <w:r>
-        <w:br/>
-      </w:r>
-      <w:r>
-        <w:rPr>
-          <w:rStyle w:val="NormalTok"/>
-        </w:rPr>
-        <w:t xml:space="preserve">pa111 </w:t>
-      </w:r>
-      <w:r>
-        <w:rPr>
-          <w:rStyle w:val="OtherTok"/>
-        </w:rPr>
-        <w:t xml:space="preserve">&lt;-</w:t>
-      </w:r>
-      <w:r>
-        <w:rPr>
-          <w:rStyle w:val="NormalTok"/>
-        </w:rPr>
-        <w:t xml:space="preserve"> </w:t>
-      </w:r>
-      <w:r>
-        <w:rPr>
-          <w:rStyle w:val="FunctionTok"/>
-        </w:rPr>
-        <w:t xml:space="preserve">pxweb_get</w:t>
-      </w:r>
-      <w:r>
-        <w:rPr>
-          <w:rStyle w:val="NormalTok"/>
-        </w:rPr>
-        <w:t xml:space="preserve">(</w:t>
-      </w:r>
-      <w:r>
-        <w:br/>
-      </w:r>
-      <w:r>
-        <w:rPr>
-          <w:rStyle w:val="NormalTok"/>
-        </w:rPr>
-        <w:t xml:space="preserve">  </w:t>
-      </w:r>
-      <w:r>
-        <w:rPr>
-          <w:rStyle w:val="AttributeTok"/>
-        </w:rPr>
-        <w:t xml:space="preserve">url =</w:t>
-      </w:r>
-      <w:r>
-        <w:rPr>
-          <w:rStyle w:val="NormalTok"/>
-        </w:rPr>
-        <w:t xml:space="preserve"> </w:t>
-      </w:r>
-      <w:r>
-        <w:rPr>
-          <w:rStyle w:val="StringTok"/>
-        </w:rPr>
-        <w:t xml:space="preserve">"https://andmed.stat.ee/api/v1/en/stat/PA111"</w:t>
-      </w:r>
-      <w:r>
-        <w:rPr>
-          <w:rStyle w:val="NormalTok"/>
-        </w:rPr>
-        <w:t xml:space="preserve">,</w:t>
-      </w:r>
-      <w:r>
-        <w:br/>
-      </w:r>
-      <w:r>
-        <w:rPr>
-          <w:rStyle w:val="NormalTok"/>
-        </w:rPr>
-        <w:t xml:space="preserve">  </w:t>
-      </w:r>
-      <w:r>
-        <w:rPr>
-          <w:rStyle w:val="AttributeTok"/>
-        </w:rPr>
-        <w:t xml:space="preserve">query =</w:t>
-      </w:r>
-      <w:r>
-        <w:rPr>
-          <w:rStyle w:val="NormalTok"/>
-        </w:rPr>
-        <w:t xml:space="preserve"> px_query_list1</w:t>
-      </w:r>
-      <w:r>
-        <w:br/>
-      </w:r>
-      <w:r>
-        <w:rPr>
-          <w:rStyle w:val="NormalTok"/>
-        </w:rPr>
-        <w:t xml:space="preserve">)</w:t>
+        <w:t xml:space="preserve">pa111_meta</w:t>
+      </w:r>
+      <w:r>
+        <w:rPr>
+          <w:rStyle w:val="SpecialCharTok"/>
+        </w:rPr>
+        <w:t xml:space="preserve">$</w:t>
+      </w:r>
+      <w:r>
+        <w:rPr>
+          <w:rStyle w:val="NormalTok"/>
+        </w:rPr>
+        <w:t xml:space="preserve">variables[[</w:t>
+      </w:r>
+      <w:r>
+        <w:rPr>
+          <w:rStyle w:val="DecValTok"/>
+        </w:rPr>
+        <w:t xml:space="preserve">1</w:t>
+      </w:r>
+      <w:r>
+        <w:rPr>
+          <w:rStyle w:val="NormalTok"/>
+        </w:rPr>
+        <w:t xml:space="preserve">]]</w:t>
+      </w:r>
+    </w:p>
+    <w:p>
+      <w:pPr>
+        <w:pStyle w:val="SourceCode"/>
+      </w:pPr>
+      <w:r>
+        <w:rPr>
+          <w:rStyle w:val="VerbatimChar"/>
+        </w:rPr>
+        <w:t xml:space="preserve">$code</w:t>
+      </w:r>
+      <w:r>
+        <w:br/>
+      </w:r>
+      <w:r>
+        <w:rPr>
+          <w:rStyle w:val="VerbatimChar"/>
+        </w:rPr>
+        <w:t xml:space="preserve">[1] "Näitaja"</w:t>
+      </w:r>
+      <w:r>
+        <w:br/>
+      </w:r>
+      <w:r>
+        <w:br/>
+      </w:r>
+      <w:r>
+        <w:rPr>
+          <w:rStyle w:val="VerbatimChar"/>
+        </w:rPr>
+        <w:t xml:space="preserve">$text</w:t>
+      </w:r>
+      <w:r>
+        <w:br/>
+      </w:r>
+      <w:r>
+        <w:rPr>
+          <w:rStyle w:val="VerbatimChar"/>
+        </w:rPr>
+        <w:t xml:space="preserve">[1] "Indicator"</w:t>
+      </w:r>
+      <w:r>
+        <w:br/>
+      </w:r>
+      <w:r>
+        <w:br/>
+      </w:r>
+      <w:r>
+        <w:rPr>
+          <w:rStyle w:val="VerbatimChar"/>
+        </w:rPr>
+        <w:t xml:space="preserve">$values</w:t>
+      </w:r>
+      <w:r>
+        <w:br/>
+      </w:r>
+      <w:r>
+        <w:rPr>
+          <w:rStyle w:val="VerbatimChar"/>
+        </w:rPr>
+        <w:t xml:space="preserve"> [1] "GR_W_AVG"    "NR_EMPL"     "GR_W_D1"     "GR_W_D2"     "GR_W_D3"    </w:t>
+      </w:r>
+      <w:r>
+        <w:br/>
+      </w:r>
+      <w:r>
+        <w:rPr>
+          <w:rStyle w:val="VerbatimChar"/>
+        </w:rPr>
+        <w:t xml:space="preserve"> [6] "GR_W_D4"     "GR_W_D5"     "GR_W_D6"     "GR_W_D7"     "GR_W_D8"    </w:t>
+      </w:r>
+      <w:r>
+        <w:br/>
+      </w:r>
+      <w:r>
+        <w:rPr>
+          <w:rStyle w:val="VerbatimChar"/>
+        </w:rPr>
+        <w:t xml:space="preserve">[11] "GR_W_D9"     "GR_W_AVG_SM"</w:t>
+      </w:r>
+      <w:r>
+        <w:br/>
+      </w:r>
+      <w:r>
+        <w:br/>
+      </w:r>
+      <w:r>
+        <w:rPr>
+          <w:rStyle w:val="VerbatimChar"/>
+        </w:rPr>
+        <w:t xml:space="preserve">$valueTexts</w:t>
+      </w:r>
+      <w:r>
+        <w:br/>
+      </w:r>
+      <w:r>
+        <w:rPr>
+          <w:rStyle w:val="VerbatimChar"/>
+        </w:rPr>
+        <w:t xml:space="preserve"> [1] "Average monthly gross wages (salaries), euros"                                                  </w:t>
+      </w:r>
+      <w:r>
+        <w:br/>
+      </w:r>
+      <w:r>
+        <w:rPr>
+          <w:rStyle w:val="VerbatimChar"/>
+        </w:rPr>
+        <w:t xml:space="preserve"> [2] "Number of employees"                                                                            </w:t>
+      </w:r>
+      <w:r>
+        <w:br/>
+      </w:r>
+      <w:r>
+        <w:rPr>
+          <w:rStyle w:val="VerbatimChar"/>
+        </w:rPr>
+        <w:t xml:space="preserve"> [3] "1st decile of monthly gross wages (salaries), euros"                                            </w:t>
+      </w:r>
+      <w:r>
+        <w:br/>
+      </w:r>
+      <w:r>
+        <w:rPr>
+          <w:rStyle w:val="VerbatimChar"/>
+        </w:rPr>
+        <w:t xml:space="preserve"> [4] "2nd decile of monthly gross wages (salaries), euros"                                            </w:t>
+      </w:r>
+      <w:r>
+        <w:br/>
+      </w:r>
+      <w:r>
+        <w:rPr>
+          <w:rStyle w:val="VerbatimChar"/>
+        </w:rPr>
+        <w:t xml:space="preserve"> [5] "3rd decile of monthly gross wages (salaries), euros"                                            </w:t>
+      </w:r>
+      <w:r>
+        <w:br/>
+      </w:r>
+      <w:r>
+        <w:rPr>
+          <w:rStyle w:val="VerbatimChar"/>
+        </w:rPr>
+        <w:t xml:space="preserve"> [6] "4th decile of monthly gross wages (salaries), euros"                                            </w:t>
+      </w:r>
+      <w:r>
+        <w:br/>
+      </w:r>
+      <w:r>
+        <w:rPr>
+          <w:rStyle w:val="VerbatimChar"/>
+        </w:rPr>
+        <w:t xml:space="preserve"> [7] "Median (5th decile) of monthly gross wages (salaries), euros"                                   </w:t>
+      </w:r>
+      <w:r>
+        <w:br/>
+      </w:r>
+      <w:r>
+        <w:rPr>
+          <w:rStyle w:val="VerbatimChar"/>
+        </w:rPr>
+        <w:t xml:space="preserve"> [8] "6th decile of monthly gross wages (salaries), euros"                                            </w:t>
+      </w:r>
+      <w:r>
+        <w:br/>
+      </w:r>
+      <w:r>
+        <w:rPr>
+          <w:rStyle w:val="VerbatimChar"/>
+        </w:rPr>
+        <w:t xml:space="preserve"> [9] "7th decile of monthly gross wages (salaries), euros"                                            </w:t>
+      </w:r>
+      <w:r>
+        <w:br/>
+      </w:r>
+      <w:r>
+        <w:rPr>
+          <w:rStyle w:val="VerbatimChar"/>
+        </w:rPr>
+        <w:t xml:space="preserve">[10] "8th decile of monthly gross wages (salaries), euros"                                            </w:t>
+      </w:r>
+      <w:r>
+        <w:br/>
+      </w:r>
+      <w:r>
+        <w:rPr>
+          <w:rStyle w:val="VerbatimChar"/>
+        </w:rPr>
+        <w:t xml:space="preserve">[11] "9th decile of monthly gross wages (salaries), euros"                                            </w:t>
+      </w:r>
+      <w:r>
+        <w:br/>
+      </w:r>
+      <w:r>
+        <w:rPr>
+          <w:rStyle w:val="VerbatimChar"/>
+        </w:rPr>
+        <w:t xml:space="preserve">[12] "Percentage change in average gross wages (salaries) compared to same period in previous year, %"</w:t>
+      </w:r>
+      <w:r>
+        <w:br/>
+      </w:r>
+      <w:r>
+        <w:br/>
+      </w:r>
+      <w:r>
+        <w:rPr>
+          <w:rStyle w:val="VerbatimChar"/>
+        </w:rPr>
+        <w:t xml:space="preserve">$elimination</w:t>
+      </w:r>
+      <w:r>
+        <w:br/>
+      </w:r>
+      <w:r>
+        <w:rPr>
+          <w:rStyle w:val="VerbatimChar"/>
+        </w:rPr>
+        <w:t xml:space="preserve">[1] FALSE</w:t>
+      </w:r>
+      <w:r>
+        <w:br/>
+      </w:r>
+      <w:r>
+        <w:br/>
+      </w:r>
+      <w:r>
+        <w:rPr>
+          <w:rStyle w:val="VerbatimChar"/>
+        </w:rPr>
+        <w:t xml:space="preserve">$time</w:t>
+      </w:r>
+      <w:r>
+        <w:br/>
+      </w:r>
+      <w:r>
+        <w:rPr>
+          <w:rStyle w:val="VerbatimChar"/>
+        </w:rPr>
+        <w:t xml:space="preserve">[1] FALSE</w:t>
+      </w:r>
+    </w:p>
+    <w:bookmarkEnd w:id="27"/>
+    <w:bookmarkStart w:id="28" w:name="fetch-data"/>
+    <w:p>
+      <w:pPr>
+        <w:pStyle w:val="Heading2"/>
+      </w:pPr>
+      <w:r>
+        <w:t xml:space="preserve">6 Fetch data</w:t>
       </w:r>
     </w:p>
     <w:p>
@@ -1786,6 +1451,353 @@
         <w:numPr>
           <w:ilvl w:val="0"/>
           <w:numId w:val="1008"/>
+        </w:numPr>
+      </w:pPr>
+      <w:r>
+        <w:t xml:space="preserve">Set: Key-value pair (as R list object) &amp; Url to the database</w:t>
+      </w:r>
+    </w:p>
+    <w:p>
+      <w:pPr>
+        <w:pStyle w:val="Compact"/>
+        <w:numPr>
+          <w:ilvl w:val="0"/>
+          <w:numId w:val="1008"/>
+        </w:numPr>
+      </w:pPr>
+      <w:r>
+        <w:t xml:space="preserve">Wildcard operator</w:t>
+      </w:r>
+      <w:r>
+        <w:t xml:space="preserve"> </w:t>
+      </w:r>
+      <w:r>
+        <w:rPr>
+          <w:rStyle w:val="VerbatimChar"/>
+        </w:rPr>
+        <w:t xml:space="preserve">*</w:t>
+      </w:r>
+      <w:r>
+        <w:t xml:space="preserve"> </w:t>
+      </w:r>
+      <w:r>
+        <w:t xml:space="preserve">to select all values</w:t>
+      </w:r>
+    </w:p>
+    <w:p>
+      <w:pPr>
+        <w:pStyle w:val="SourceCode"/>
+      </w:pPr>
+      <w:r>
+        <w:rPr>
+          <w:rStyle w:val="NormalTok"/>
+        </w:rPr>
+        <w:t xml:space="preserve">px_query_list1 </w:t>
+      </w:r>
+      <w:r>
+        <w:rPr>
+          <w:rStyle w:val="OtherTok"/>
+        </w:rPr>
+        <w:t xml:space="preserve">&lt;-</w:t>
+      </w:r>
+      <w:r>
+        <w:rPr>
+          <w:rStyle w:val="NormalTok"/>
+        </w:rPr>
+        <w:t xml:space="preserve"> </w:t>
+      </w:r>
+      <w:r>
+        <w:rPr>
+          <w:rStyle w:val="FunctionTok"/>
+        </w:rPr>
+        <w:t xml:space="preserve">list</w:t>
+      </w:r>
+      <w:r>
+        <w:rPr>
+          <w:rStyle w:val="NormalTok"/>
+        </w:rPr>
+        <w:t xml:space="preserve">(</w:t>
+      </w:r>
+      <w:r>
+        <w:br/>
+      </w:r>
+      <w:r>
+        <w:rPr>
+          <w:rStyle w:val="NormalTok"/>
+        </w:rPr>
+        <w:t xml:space="preserve">  </w:t>
+      </w:r>
+      <w:r>
+        <w:rPr>
+          <w:rStyle w:val="StringTok"/>
+        </w:rPr>
+        <w:t xml:space="preserve">"Näitaja"</w:t>
+      </w:r>
+      <w:r>
+        <w:rPr>
+          <w:rStyle w:val="NormalTok"/>
+        </w:rPr>
+        <w:t xml:space="preserve"> </w:t>
+      </w:r>
+      <w:r>
+        <w:rPr>
+          <w:rStyle w:val="OtherTok"/>
+        </w:rPr>
+        <w:t xml:space="preserve">=</w:t>
+      </w:r>
+      <w:r>
+        <w:rPr>
+          <w:rStyle w:val="NormalTok"/>
+        </w:rPr>
+        <w:t xml:space="preserve"> </w:t>
+      </w:r>
+      <w:r>
+        <w:rPr>
+          <w:rStyle w:val="FunctionTok"/>
+        </w:rPr>
+        <w:t xml:space="preserve">c</w:t>
+      </w:r>
+      <w:r>
+        <w:rPr>
+          <w:rStyle w:val="NormalTok"/>
+        </w:rPr>
+        <w:t xml:space="preserve">(</w:t>
+      </w:r>
+      <w:r>
+        <w:rPr>
+          <w:rStyle w:val="StringTok"/>
+        </w:rPr>
+        <w:t xml:space="preserve">"GR_W_D1"</w:t>
+      </w:r>
+      <w:r>
+        <w:rPr>
+          <w:rStyle w:val="NormalTok"/>
+        </w:rPr>
+        <w:t xml:space="preserve">, </w:t>
+      </w:r>
+      <w:r>
+        <w:rPr>
+          <w:rStyle w:val="StringTok"/>
+        </w:rPr>
+        <w:t xml:space="preserve">"GR_W_D5"</w:t>
+      </w:r>
+      <w:r>
+        <w:rPr>
+          <w:rStyle w:val="NormalTok"/>
+        </w:rPr>
+        <w:t xml:space="preserve">, </w:t>
+      </w:r>
+      <w:r>
+        <w:rPr>
+          <w:rStyle w:val="StringTok"/>
+        </w:rPr>
+        <w:t xml:space="preserve">"GR_W_D9"</w:t>
+      </w:r>
+      <w:r>
+        <w:rPr>
+          <w:rStyle w:val="NormalTok"/>
+        </w:rPr>
+        <w:t xml:space="preserve">),</w:t>
+      </w:r>
+      <w:r>
+        <w:br/>
+      </w:r>
+      <w:r>
+        <w:rPr>
+          <w:rStyle w:val="NormalTok"/>
+        </w:rPr>
+        <w:t xml:space="preserve">  </w:t>
+      </w:r>
+      <w:r>
+        <w:rPr>
+          <w:rStyle w:val="StringTok"/>
+        </w:rPr>
+        <w:t xml:space="preserve">"Tegevusala"</w:t>
+      </w:r>
+      <w:r>
+        <w:rPr>
+          <w:rStyle w:val="NormalTok"/>
+        </w:rPr>
+        <w:t xml:space="preserve"> </w:t>
+      </w:r>
+      <w:r>
+        <w:rPr>
+          <w:rStyle w:val="OtherTok"/>
+        </w:rPr>
+        <w:t xml:space="preserve">=</w:t>
+      </w:r>
+      <w:r>
+        <w:rPr>
+          <w:rStyle w:val="NormalTok"/>
+        </w:rPr>
+        <w:t xml:space="preserve"> </w:t>
+      </w:r>
+      <w:r>
+        <w:rPr>
+          <w:rStyle w:val="StringTok"/>
+        </w:rPr>
+        <w:t xml:space="preserve">"*"</w:t>
+      </w:r>
+      <w:r>
+        <w:rPr>
+          <w:rStyle w:val="NormalTok"/>
+        </w:rPr>
+        <w:t xml:space="preserve">,</w:t>
+      </w:r>
+      <w:r>
+        <w:br/>
+      </w:r>
+      <w:r>
+        <w:rPr>
+          <w:rStyle w:val="NormalTok"/>
+        </w:rPr>
+        <w:t xml:space="preserve">  </w:t>
+      </w:r>
+      <w:r>
+        <w:rPr>
+          <w:rStyle w:val="StringTok"/>
+        </w:rPr>
+        <w:t xml:space="preserve">"Vaatlusperiood"</w:t>
+      </w:r>
+      <w:r>
+        <w:rPr>
+          <w:rStyle w:val="NormalTok"/>
+        </w:rPr>
+        <w:t xml:space="preserve"> </w:t>
+      </w:r>
+      <w:r>
+        <w:rPr>
+          <w:rStyle w:val="OtherTok"/>
+        </w:rPr>
+        <w:t xml:space="preserve">=</w:t>
+      </w:r>
+      <w:r>
+        <w:rPr>
+          <w:rStyle w:val="NormalTok"/>
+        </w:rPr>
+        <w:t xml:space="preserve"> </w:t>
+      </w:r>
+      <w:r>
+        <w:rPr>
+          <w:rStyle w:val="StringTok"/>
+        </w:rPr>
+        <w:t xml:space="preserve">"*"</w:t>
+      </w:r>
+      <w:r>
+        <w:br/>
+      </w:r>
+      <w:r>
+        <w:rPr>
+          <w:rStyle w:val="NormalTok"/>
+        </w:rPr>
+        <w:t xml:space="preserve">)</w:t>
+      </w:r>
+      <w:r>
+        <w:br/>
+      </w:r>
+      <w:r>
+        <w:br/>
+      </w:r>
+      <w:r>
+        <w:rPr>
+          <w:rStyle w:val="NormalTok"/>
+        </w:rPr>
+        <w:t xml:space="preserve">pa111 </w:t>
+      </w:r>
+      <w:r>
+        <w:rPr>
+          <w:rStyle w:val="OtherTok"/>
+        </w:rPr>
+        <w:t xml:space="preserve">&lt;-</w:t>
+      </w:r>
+      <w:r>
+        <w:rPr>
+          <w:rStyle w:val="NormalTok"/>
+        </w:rPr>
+        <w:t xml:space="preserve"> </w:t>
+      </w:r>
+      <w:r>
+        <w:rPr>
+          <w:rStyle w:val="FunctionTok"/>
+        </w:rPr>
+        <w:t xml:space="preserve">pxweb_get</w:t>
+      </w:r>
+      <w:r>
+        <w:rPr>
+          <w:rStyle w:val="NormalTok"/>
+        </w:rPr>
+        <w:t xml:space="preserve">(</w:t>
+      </w:r>
+      <w:r>
+        <w:br/>
+      </w:r>
+      <w:r>
+        <w:rPr>
+          <w:rStyle w:val="NormalTok"/>
+        </w:rPr>
+        <w:t xml:space="preserve">  </w:t>
+      </w:r>
+      <w:r>
+        <w:rPr>
+          <w:rStyle w:val="AttributeTok"/>
+        </w:rPr>
+        <w:t xml:space="preserve">url =</w:t>
+      </w:r>
+      <w:r>
+        <w:rPr>
+          <w:rStyle w:val="NormalTok"/>
+        </w:rPr>
+        <w:t xml:space="preserve"> </w:t>
+      </w:r>
+      <w:r>
+        <w:rPr>
+          <w:rStyle w:val="StringTok"/>
+        </w:rPr>
+        <w:t xml:space="preserve">"https://andmed.stat.ee/api/v1/en/stat/PA111"</w:t>
+      </w:r>
+      <w:r>
+        <w:rPr>
+          <w:rStyle w:val="NormalTok"/>
+        </w:rPr>
+        <w:t xml:space="preserve">,</w:t>
+      </w:r>
+      <w:r>
+        <w:br/>
+      </w:r>
+      <w:r>
+        <w:rPr>
+          <w:rStyle w:val="NormalTok"/>
+        </w:rPr>
+        <w:t xml:space="preserve">  </w:t>
+      </w:r>
+      <w:r>
+        <w:rPr>
+          <w:rStyle w:val="AttributeTok"/>
+        </w:rPr>
+        <w:t xml:space="preserve">query =</w:t>
+      </w:r>
+      <w:r>
+        <w:rPr>
+          <w:rStyle w:val="NormalTok"/>
+        </w:rPr>
+        <w:t xml:space="preserve"> px_query_list1</w:t>
+      </w:r>
+      <w:r>
+        <w:br/>
+      </w:r>
+      <w:r>
+        <w:rPr>
+          <w:rStyle w:val="NormalTok"/>
+        </w:rPr>
+        <w:t xml:space="preserve">)</w:t>
+      </w:r>
+    </w:p>
+    <w:p>
+      <w:pPr>
+        <w:pStyle w:val="Compact"/>
+        <w:numPr>
+          <w:ilvl w:val="0"/>
+          <w:numId w:val="1009"/>
         </w:numPr>
       </w:pPr>
       <w:r>
@@ -3556,6 +3568,9 @@
     <w:abstractNumId w:val="991"/>
   </w:num>
   <w:num w:numId="1005">
+    <w:abstractNumId w:val="991"/>
+  </w:num>
+  <w:num w:numId="1006">
     <w:abstractNumId w:val="99411"/>
     <w:lvlOverride w:ilvl="0">
       <w:startOverride w:val="1"/>
@@ -3585,13 +3600,13 @@
       <w:startOverride w:val="1"/>
     </w:lvlOverride>
   </w:num>
-  <w:num w:numId="1006">
-    <w:abstractNumId w:val="991"/>
-  </w:num>
   <w:num w:numId="1007">
     <w:abstractNumId w:val="991"/>
   </w:num>
   <w:num w:numId="1008">
+    <w:abstractNumId w:val="991"/>
+  </w:num>
+  <w:num w:numId="1009">
     <w:abstractNumId w:val="991"/>
   </w:num>
 </w:numbering>

</xml_diff>